<commit_message>
Minified, performance-optimized production runtime for the customer and editor editions
- Server: tree-shaken, minified bundle (names kept), then compiled to V8 bytecode as before
- Web: minified JS and CSS, React in its own long-cached chunk, other libraries split
  naturally so the BPMN editor loads only when opened; no source maps, licence comments or
  debugger statements; Brotli and gzip copies of the text assets
- Server serves the pre-compressed assets directly, caches hashed assets for a year
  (immutable), revalidates index.html, and gzips API responses (compression)
- Obfuscation step removed (runtime cost); static imports of api.js in multi-entry
- Installation guides updated (FR, DOCX and PDF)

Co-Authored-By: Claude Opus 5.5 <noreply@anthropic.com>
Claude-Session: https://claude.ai/code/session_018jWCkFayhGXSEUDh9BTEcJ
</commit_message>
<xml_diff>
--- a/DynamicMS/deliverables/Guide_Installation_Docker_Runtime_Customer_Linux_DynamicMS_FR.docx
+++ b/DynamicMS/deliverables/Guide_Installation_Docker_Runtime_Customer_Linux_DynamicMS_FR.docx
@@ -306,7 +306,7 @@
             </w:rPr>
             <w:fldChar w:fldCharType="separate"/>
           </w:r>
-          <w:hyperlink w:anchor="__RefHeading___Toc1508_1162042918">
+          <w:hyperlink w:anchor="__RefHeading___Toc1508_4137183342">
             <w:r>
               <w:rPr>
                 <w:webHidden/>
@@ -327,7 +327,7 @@
             </w:tabs>
             <w:rPr/>
           </w:pPr>
-          <w:hyperlink w:anchor="__RefHeading___Toc1510_1162042918">
+          <w:hyperlink w:anchor="__RefHeading___Toc1510_4137183342">
             <w:r>
               <w:rPr>
                 <w:webHidden/>
@@ -348,7 +348,7 @@
             </w:tabs>
             <w:rPr/>
           </w:pPr>
-          <w:hyperlink w:anchor="__RefHeading___Toc1512_1162042918">
+          <w:hyperlink w:anchor="__RefHeading___Toc1512_4137183342">
             <w:r>
               <w:rPr>
                 <w:webHidden/>
@@ -369,7 +369,7 @@
             </w:tabs>
             <w:rPr/>
           </w:pPr>
-          <w:hyperlink w:anchor="__RefHeading___Toc1514_1162042918">
+          <w:hyperlink w:anchor="__RefHeading___Toc1514_4137183342">
             <w:r>
               <w:rPr>
                 <w:webHidden/>
@@ -390,7 +390,7 @@
             </w:tabs>
             <w:rPr/>
           </w:pPr>
-          <w:hyperlink w:anchor="__RefHeading___Toc1516_1162042918">
+          <w:hyperlink w:anchor="__RefHeading___Toc1516_4137183342">
             <w:r>
               <w:rPr>
                 <w:webHidden/>
@@ -411,7 +411,7 @@
             </w:tabs>
             <w:rPr/>
           </w:pPr>
-          <w:hyperlink w:anchor="__RefHeading___Toc1518_1162042918">
+          <w:hyperlink w:anchor="__RefHeading___Toc1518_4137183342">
             <w:r>
               <w:rPr>
                 <w:webHidden/>
@@ -432,7 +432,7 @@
             </w:tabs>
             <w:rPr/>
           </w:pPr>
-          <w:hyperlink w:anchor="__RefHeading___Toc1520_1162042918">
+          <w:hyperlink w:anchor="__RefHeading___Toc1520_4137183342">
             <w:r>
               <w:rPr>
                 <w:webHidden/>
@@ -453,7 +453,7 @@
             </w:tabs>
             <w:rPr/>
           </w:pPr>
-          <w:hyperlink w:anchor="__RefHeading___Toc1522_1162042918">
+          <w:hyperlink w:anchor="__RefHeading___Toc1522_4137183342">
             <w:r>
               <w:rPr>
                 <w:webHidden/>
@@ -474,7 +474,7 @@
             </w:tabs>
             <w:rPr/>
           </w:pPr>
-          <w:hyperlink w:anchor="__RefHeading___Toc1524_1162042918">
+          <w:hyperlink w:anchor="__RefHeading___Toc1524_4137183342">
             <w:r>
               <w:rPr>
                 <w:webHidden/>
@@ -495,7 +495,7 @@
             </w:tabs>
             <w:rPr/>
           </w:pPr>
-          <w:hyperlink w:anchor="__RefHeading___Toc1526_1162042918">
+          <w:hyperlink w:anchor="__RefHeading___Toc1526_4137183342">
             <w:r>
               <w:rPr>
                 <w:webHidden/>
@@ -516,7 +516,7 @@
             </w:tabs>
             <w:rPr/>
           </w:pPr>
-          <w:hyperlink w:anchor="__RefHeading___Toc1528_1162042918">
+          <w:hyperlink w:anchor="__RefHeading___Toc1528_4137183342">
             <w:r>
               <w:rPr>
                 <w:webHidden/>
@@ -537,7 +537,7 @@
             </w:tabs>
             <w:rPr/>
           </w:pPr>
-          <w:hyperlink w:anchor="__RefHeading___Toc1530_1162042918">
+          <w:hyperlink w:anchor="__RefHeading___Toc1530_4137183342">
             <w:r>
               <w:rPr>
                 <w:webHidden/>
@@ -558,7 +558,7 @@
             </w:tabs>
             <w:rPr/>
           </w:pPr>
-          <w:hyperlink w:anchor="__RefHeading___Toc1532_1162042918">
+          <w:hyperlink w:anchor="__RefHeading___Toc1532_4137183342">
             <w:r>
               <w:rPr>
                 <w:webHidden/>
@@ -579,7 +579,7 @@
             </w:tabs>
             <w:rPr/>
           </w:pPr>
-          <w:hyperlink w:anchor="__RefHeading___Toc1534_1162042918">
+          <w:hyperlink w:anchor="__RefHeading___Toc1534_4137183342">
             <w:r>
               <w:rPr>
                 <w:webHidden/>
@@ -600,7 +600,7 @@
             </w:tabs>
             <w:rPr/>
           </w:pPr>
-          <w:hyperlink w:anchor="__RefHeading___Toc1536_1162042918">
+          <w:hyperlink w:anchor="__RefHeading___Toc1536_4137183342">
             <w:r>
               <w:rPr>
                 <w:webHidden/>
@@ -621,7 +621,7 @@
             </w:tabs>
             <w:rPr/>
           </w:pPr>
-          <w:hyperlink w:anchor="__RefHeading___Toc1538_1162042918">
+          <w:hyperlink w:anchor="__RefHeading___Toc1538_4137183342">
             <w:r>
               <w:rPr>
                 <w:webHidden/>
@@ -642,7 +642,7 @@
             </w:tabs>
             <w:rPr/>
           </w:pPr>
-          <w:hyperlink w:anchor="__RefHeading___Toc1540_1162042918">
+          <w:hyperlink w:anchor="__RefHeading___Toc1540_4137183342">
             <w:r>
               <w:rPr>
                 <w:webHidden/>
@@ -663,7 +663,7 @@
             </w:tabs>
             <w:rPr/>
           </w:pPr>
-          <w:hyperlink w:anchor="__RefHeading___Toc1542_1162042918">
+          <w:hyperlink w:anchor="__RefHeading___Toc1542_4137183342">
             <w:r>
               <w:rPr>
                 <w:webHidden/>
@@ -684,7 +684,7 @@
             </w:tabs>
             <w:rPr/>
           </w:pPr>
-          <w:hyperlink w:anchor="__RefHeading___Toc1544_1162042918">
+          <w:hyperlink w:anchor="__RefHeading___Toc1544_4137183342">
             <w:r>
               <w:rPr>
                 <w:webHidden/>
@@ -705,7 +705,7 @@
             </w:tabs>
             <w:rPr/>
           </w:pPr>
-          <w:hyperlink w:anchor="__RefHeading___Toc1546_1162042918">
+          <w:hyperlink w:anchor="__RefHeading___Toc1546_4137183342">
             <w:r>
               <w:rPr>
                 <w:webHidden/>
@@ -726,7 +726,7 @@
             </w:tabs>
             <w:rPr/>
           </w:pPr>
-          <w:hyperlink w:anchor="__RefHeading___Toc1548_1162042918">
+          <w:hyperlink w:anchor="__RefHeading___Toc1548_4137183342">
             <w:r>
               <w:rPr>
                 <w:webHidden/>
@@ -747,7 +747,7 @@
             </w:tabs>
             <w:rPr/>
           </w:pPr>
-          <w:hyperlink w:anchor="__RefHeading___Toc1550_1162042918">
+          <w:hyperlink w:anchor="__RefHeading___Toc1550_4137183342">
             <w:r>
               <w:rPr>
                 <w:webHidden/>
@@ -768,7 +768,7 @@
             </w:tabs>
             <w:rPr/>
           </w:pPr>
-          <w:hyperlink w:anchor="__RefHeading___Toc1552_1162042918">
+          <w:hyperlink w:anchor="__RefHeading___Toc1552_4137183342">
             <w:r>
               <w:rPr>
                 <w:webHidden/>
@@ -789,7 +789,7 @@
             </w:tabs>
             <w:rPr/>
           </w:pPr>
-          <w:hyperlink w:anchor="__RefHeading___Toc1554_1162042918">
+          <w:hyperlink w:anchor="__RefHeading___Toc1554_4137183342">
             <w:r>
               <w:rPr>
                 <w:webHidden/>
@@ -810,7 +810,7 @@
             </w:tabs>
             <w:rPr/>
           </w:pPr>
-          <w:hyperlink w:anchor="__RefHeading___Toc1556_1162042918">
+          <w:hyperlink w:anchor="__RefHeading___Toc1556_4137183342">
             <w:r>
               <w:rPr>
                 <w:webHidden/>
@@ -831,7 +831,7 @@
             </w:tabs>
             <w:rPr/>
           </w:pPr>
-          <w:hyperlink w:anchor="__RefHeading___Toc1558_1162042918">
+          <w:hyperlink w:anchor="__RefHeading___Toc1558_4137183342">
             <w:r>
               <w:rPr>
                 <w:webHidden/>
@@ -852,7 +852,7 @@
             </w:tabs>
             <w:rPr/>
           </w:pPr>
-          <w:hyperlink w:anchor="__RefHeading___Toc1560_1162042918">
+          <w:hyperlink w:anchor="__RefHeading___Toc1560_4137183342">
             <w:r>
               <w:rPr>
                 <w:webHidden/>
@@ -873,7 +873,7 @@
             </w:tabs>
             <w:rPr/>
           </w:pPr>
-          <w:hyperlink w:anchor="__RefHeading___Toc1562_1162042918">
+          <w:hyperlink w:anchor="__RefHeading___Toc1562_4137183342">
             <w:r>
               <w:rPr>
                 <w:webHidden/>
@@ -894,7 +894,7 @@
             </w:tabs>
             <w:rPr/>
           </w:pPr>
-          <w:hyperlink w:anchor="__RefHeading___Toc1564_1162042918">
+          <w:hyperlink w:anchor="__RefHeading___Toc1564_4137183342">
             <w:r>
               <w:rPr>
                 <w:webHidden/>
@@ -915,7 +915,7 @@
             </w:tabs>
             <w:rPr/>
           </w:pPr>
-          <w:hyperlink w:anchor="__RefHeading___Toc1566_1162042918">
+          <w:hyperlink w:anchor="__RefHeading___Toc1566_4137183342">
             <w:r>
               <w:rPr>
                 <w:webHidden/>
@@ -936,7 +936,7 @@
             </w:tabs>
             <w:rPr/>
           </w:pPr>
-          <w:hyperlink w:anchor="__RefHeading___Toc1568_1162042918">
+          <w:hyperlink w:anchor="__RefHeading___Toc1568_4137183342">
             <w:r>
               <w:rPr>
                 <w:webHidden/>
@@ -957,7 +957,7 @@
             </w:tabs>
             <w:rPr/>
           </w:pPr>
-          <w:hyperlink w:anchor="__RefHeading___Toc1570_1162042918">
+          <w:hyperlink w:anchor="__RefHeading___Toc1570_4137183342">
             <w:r>
               <w:rPr>
                 <w:webHidden/>
@@ -1007,7 +1007,7 @@
         <w:spacing w:before="0" w:after="160"/>
         <w:rPr/>
       </w:pPr>
-      <w:bookmarkStart w:id="0" w:name="__RefHeading___Toc1508_1162042918"/>
+      <w:bookmarkStart w:id="0" w:name="__RefHeading___Toc1508_4137183342"/>
       <w:bookmarkEnd w:id="0"/>
       <w:r>
         <w:rPr/>
@@ -1050,7 +1050,7 @@
         <w:rPr>
           <w:sz w:val="20"/>
         </w:rPr>
-        <w:t>l'application est livrée exécutable, sans code source. Le serveur est compilé en code machine virtuel (bytecode V8) et l'interface web est obfusquée.</w:t>
+        <w:t>l'application est livrée exécutable, sans code source. Version de production optimisée : le serveur est minifié puis compilé en code machine virtuel (bytecode V8) ; l'interface web est minifiée, découpée en modules chargés à la demande et précompressée (Brotli, gzip).</w:t>
       </w:r>
     </w:p>
     <w:p>
@@ -1139,7 +1139,7 @@
         <w:pStyle w:val="Heading1"/>
         <w:rPr/>
       </w:pPr>
-      <w:bookmarkStart w:id="1" w:name="__RefHeading___Toc1510_1162042918"/>
+      <w:bookmarkStart w:id="1" w:name="__RefHeading___Toc1510_4137183342"/>
       <w:bookmarkEnd w:id="1"/>
       <w:r>
         <w:rPr/>
@@ -1595,7 +1595,7 @@
         <w:pStyle w:val="Heading2"/>
         <w:rPr/>
       </w:pPr>
-      <w:bookmarkStart w:id="2" w:name="__RefHeading___Toc1512_1162042918"/>
+      <w:bookmarkStart w:id="2" w:name="__RefHeading___Toc1512_4137183342"/>
       <w:bookmarkEnd w:id="2"/>
       <w:r>
         <w:rPr/>
@@ -2096,7 +2096,7 @@
         <w:pStyle w:val="Heading1"/>
         <w:rPr/>
       </w:pPr>
-      <w:bookmarkStart w:id="3" w:name="__RefHeading___Toc1514_1162042918"/>
+      <w:bookmarkStart w:id="3" w:name="__RefHeading___Toc1514_4137183342"/>
       <w:bookmarkEnd w:id="3"/>
       <w:r>
         <w:rPr/>
@@ -2234,7 +2234,7 @@
                 <w:color w:val="123A5F"/>
                 <w:sz w:val="19"/>
               </w:rPr>
-              <w:t>Serveur DynamicMS compilé (bytecode) et interface web obfusquée ; aucun fichier source.</w:t>
+              <w:t>Serveur DynamicMS minifié et compilé (bytecode V8), interface web minifiée et précompressée ; aucun fichier source.</w:t>
             </w:r>
           </w:p>
         </w:tc>
@@ -2540,7 +2540,7 @@
         <w:pStyle w:val="Heading1"/>
         <w:rPr/>
       </w:pPr>
-      <w:bookmarkStart w:id="4" w:name="__RefHeading___Toc1516_1162042918"/>
+      <w:bookmarkStart w:id="4" w:name="__RefHeading___Toc1516_4137183342"/>
       <w:bookmarkEnd w:id="4"/>
       <w:r>
         <w:rPr/>
@@ -3259,7 +3259,7 @@
         <w:pStyle w:val="Heading2"/>
         <w:rPr/>
       </w:pPr>
-      <w:bookmarkStart w:id="5" w:name="__RefHeading___Toc1518_1162042918"/>
+      <w:bookmarkStart w:id="5" w:name="__RefHeading___Toc1518_4137183342"/>
       <w:bookmarkEnd w:id="5"/>
       <w:r>
         <w:rPr/>
@@ -3271,7 +3271,7 @@
         <w:pStyle w:val="Heading3"/>
         <w:rPr/>
       </w:pPr>
-      <w:bookmarkStart w:id="6" w:name="__RefHeading___Toc1520_1162042918"/>
+      <w:bookmarkStart w:id="6" w:name="__RefHeading___Toc1520_4137183342"/>
       <w:bookmarkEnd w:id="6"/>
       <w:r>
         <w:rPr/>
@@ -3465,7 +3465,7 @@
         <w:pStyle w:val="Heading3"/>
         <w:rPr/>
       </w:pPr>
-      <w:bookmarkStart w:id="7" w:name="__RefHeading___Toc1522_1162042918"/>
+      <w:bookmarkStart w:id="7" w:name="__RefHeading___Toc1522_4137183342"/>
       <w:bookmarkEnd w:id="7"/>
       <w:r>
         <w:rPr/>
@@ -3545,7 +3545,7 @@
         <w:pStyle w:val="Heading3"/>
         <w:rPr/>
       </w:pPr>
-      <w:bookmarkStart w:id="8" w:name="__RefHeading___Toc1524_1162042918"/>
+      <w:bookmarkStart w:id="8" w:name="__RefHeading___Toc1524_4137183342"/>
       <w:bookmarkEnd w:id="8"/>
       <w:r>
         <w:rPr/>
@@ -3621,7 +3621,7 @@
         <w:pStyle w:val="Heading1"/>
         <w:rPr/>
       </w:pPr>
-      <w:bookmarkStart w:id="9" w:name="__RefHeading___Toc1526_1162042918"/>
+      <w:bookmarkStart w:id="9" w:name="__RefHeading___Toc1526_4137183342"/>
       <w:bookmarkEnd w:id="9"/>
       <w:r>
         <w:rPr/>
@@ -3633,7 +3633,7 @@
         <w:pStyle w:val="Heading2"/>
         <w:rPr/>
       </w:pPr>
-      <w:bookmarkStart w:id="10" w:name="__RefHeading___Toc1528_1162042918"/>
+      <w:bookmarkStart w:id="10" w:name="__RefHeading___Toc1528_4137183342"/>
       <w:bookmarkEnd w:id="10"/>
       <w:r>
         <w:rPr/>
@@ -3747,7 +3747,7 @@
         <w:pStyle w:val="Heading2"/>
         <w:rPr/>
       </w:pPr>
-      <w:bookmarkStart w:id="11" w:name="__RefHeading___Toc1530_1162042918"/>
+      <w:bookmarkStart w:id="11" w:name="__RefHeading___Toc1530_4137183342"/>
       <w:bookmarkEnd w:id="11"/>
       <w:r>
         <w:rPr/>
@@ -3890,7 +3890,7 @@
         <w:pStyle w:val="Heading2"/>
         <w:rPr/>
       </w:pPr>
-      <w:bookmarkStart w:id="12" w:name="__RefHeading___Toc1532_1162042918"/>
+      <w:bookmarkStart w:id="12" w:name="__RefHeading___Toc1532_4137183342"/>
       <w:bookmarkEnd w:id="12"/>
       <w:r>
         <w:rPr/>
@@ -4850,7 +4850,7 @@
         <w:pStyle w:val="Heading2"/>
         <w:rPr/>
       </w:pPr>
-      <w:bookmarkStart w:id="13" w:name="__RefHeading___Toc1534_1162042918"/>
+      <w:bookmarkStart w:id="13" w:name="__RefHeading___Toc1534_4137183342"/>
       <w:bookmarkEnd w:id="13"/>
       <w:r>
         <w:rPr/>
@@ -4926,7 +4926,7 @@
         <w:pStyle w:val="Heading2"/>
         <w:rPr/>
       </w:pPr>
-      <w:bookmarkStart w:id="14" w:name="__RefHeading___Toc1536_1162042918"/>
+      <w:bookmarkStart w:id="14" w:name="__RefHeading___Toc1536_4137183342"/>
       <w:bookmarkEnd w:id="14"/>
       <w:r>
         <w:rPr/>
@@ -5048,7 +5048,7 @@
         <w:pStyle w:val="Heading1"/>
         <w:rPr/>
       </w:pPr>
-      <w:bookmarkStart w:id="15" w:name="__RefHeading___Toc1538_1162042918"/>
+      <w:bookmarkStart w:id="15" w:name="__RefHeading___Toc1538_4137183342"/>
       <w:bookmarkEnd w:id="15"/>
       <w:r>
         <w:rPr/>
@@ -5208,7 +5208,7 @@
         <w:pStyle w:val="Heading1"/>
         <w:rPr/>
       </w:pPr>
-      <w:bookmarkStart w:id="16" w:name="__RefHeading___Toc1540_1162042918"/>
+      <w:bookmarkStart w:id="16" w:name="__RefHeading___Toc1540_4137183342"/>
       <w:bookmarkEnd w:id="16"/>
       <w:r>
         <w:rPr/>
@@ -5220,7 +5220,7 @@
         <w:pStyle w:val="Heading2"/>
         <w:rPr/>
       </w:pPr>
-      <w:bookmarkStart w:id="17" w:name="__RefHeading___Toc1542_1162042918"/>
+      <w:bookmarkStart w:id="17" w:name="__RefHeading___Toc1542_4137183342"/>
       <w:bookmarkEnd w:id="17"/>
       <w:r>
         <w:rPr/>
@@ -5340,7 +5340,7 @@
         <w:pStyle w:val="Heading2"/>
         <w:rPr/>
       </w:pPr>
-      <w:bookmarkStart w:id="18" w:name="__RefHeading___Toc1544_1162042918"/>
+      <w:bookmarkStart w:id="18" w:name="__RefHeading___Toc1544_4137183342"/>
       <w:bookmarkEnd w:id="18"/>
       <w:r>
         <w:rPr/>
@@ -5544,7 +5544,7 @@
         <w:pStyle w:val="Heading2"/>
         <w:rPr/>
       </w:pPr>
-      <w:bookmarkStart w:id="19" w:name="__RefHeading___Toc1546_1162042918"/>
+      <w:bookmarkStart w:id="19" w:name="__RefHeading___Toc1546_4137183342"/>
       <w:bookmarkEnd w:id="19"/>
       <w:r>
         <w:rPr/>
@@ -5568,7 +5568,7 @@
         <w:pStyle w:val="Heading2"/>
         <w:rPr/>
       </w:pPr>
-      <w:bookmarkStart w:id="20" w:name="__RefHeading___Toc1548_1162042918"/>
+      <w:bookmarkStart w:id="20" w:name="__RefHeading___Toc1548_4137183342"/>
       <w:bookmarkEnd w:id="20"/>
       <w:r>
         <w:rPr/>
@@ -5592,7 +5592,7 @@
         <w:pStyle w:val="Heading2"/>
         <w:rPr/>
       </w:pPr>
-      <w:bookmarkStart w:id="21" w:name="__RefHeading___Toc1550_1162042918"/>
+      <w:bookmarkStart w:id="21" w:name="__RefHeading___Toc1550_4137183342"/>
       <w:bookmarkEnd w:id="21"/>
       <w:r>
         <w:rPr/>
@@ -6302,7 +6302,7 @@
         <w:pStyle w:val="Heading1"/>
         <w:rPr/>
       </w:pPr>
-      <w:bookmarkStart w:id="22" w:name="__RefHeading___Toc1552_1162042918"/>
+      <w:bookmarkStart w:id="22" w:name="__RefHeading___Toc1552_4137183342"/>
       <w:bookmarkEnd w:id="22"/>
       <w:r>
         <w:rPr/>
@@ -6326,7 +6326,7 @@
         <w:pStyle w:val="Heading3"/>
         <w:rPr/>
       </w:pPr>
-      <w:bookmarkStart w:id="23" w:name="__RefHeading___Toc1554_1162042918"/>
+      <w:bookmarkStart w:id="23" w:name="__RefHeading___Toc1554_4137183342"/>
       <w:bookmarkEnd w:id="23"/>
       <w:r>
         <w:rPr/>
@@ -7511,7 +7511,7 @@
         <w:pStyle w:val="Heading3"/>
         <w:rPr/>
       </w:pPr>
-      <w:bookmarkStart w:id="24" w:name="__RefHeading___Toc1556_1162042918"/>
+      <w:bookmarkStart w:id="24" w:name="__RefHeading___Toc1556_4137183342"/>
       <w:bookmarkEnd w:id="24"/>
       <w:r>
         <w:rPr/>
@@ -14406,7 +14406,7 @@
         <w:pStyle w:val="Heading1"/>
         <w:rPr/>
       </w:pPr>
-      <w:bookmarkStart w:id="25" w:name="__RefHeading___Toc1558_1162042918"/>
+      <w:bookmarkStart w:id="25" w:name="__RefHeading___Toc1558_4137183342"/>
       <w:bookmarkEnd w:id="25"/>
       <w:r>
         <w:rPr/>
@@ -14418,7 +14418,7 @@
         <w:pStyle w:val="Heading2"/>
         <w:rPr/>
       </w:pPr>
-      <w:bookmarkStart w:id="26" w:name="__RefHeading___Toc1560_1162042918"/>
+      <w:bookmarkStart w:id="26" w:name="__RefHeading___Toc1560_4137183342"/>
       <w:bookmarkEnd w:id="26"/>
       <w:r>
         <w:rPr/>
@@ -14532,7 +14532,7 @@
         <w:pStyle w:val="Heading2"/>
         <w:rPr/>
       </w:pPr>
-      <w:bookmarkStart w:id="27" w:name="__RefHeading___Toc1562_1162042918"/>
+      <w:bookmarkStart w:id="27" w:name="__RefHeading___Toc1562_4137183342"/>
       <w:bookmarkEnd w:id="27"/>
       <w:r>
         <w:rPr/>
@@ -14693,7 +14693,7 @@
         <w:pStyle w:val="Heading2"/>
         <w:rPr/>
       </w:pPr>
-      <w:bookmarkStart w:id="28" w:name="__RefHeading___Toc1564_1162042918"/>
+      <w:bookmarkStart w:id="28" w:name="__RefHeading___Toc1564_4137183342"/>
       <w:bookmarkEnd w:id="28"/>
       <w:r>
         <w:rPr/>
@@ -14773,7 +14773,7 @@
         <w:pStyle w:val="Heading2"/>
         <w:rPr/>
       </w:pPr>
-      <w:bookmarkStart w:id="29" w:name="__RefHeading___Toc1566_1162042918"/>
+      <w:bookmarkStart w:id="29" w:name="__RefHeading___Toc1566_4137183342"/>
       <w:bookmarkEnd w:id="29"/>
       <w:r>
         <w:rPr/>
@@ -14861,7 +14861,7 @@
         <w:pStyle w:val="Heading1"/>
         <w:rPr/>
       </w:pPr>
-      <w:bookmarkStart w:id="30" w:name="__RefHeading___Toc1568_1162042918"/>
+      <w:bookmarkStart w:id="30" w:name="__RefHeading___Toc1568_4137183342"/>
       <w:bookmarkEnd w:id="30"/>
       <w:r>
         <w:rPr/>
@@ -15755,7 +15755,7 @@
         <w:pStyle w:val="Heading2"/>
         <w:rPr/>
       </w:pPr>
-      <w:bookmarkStart w:id="31" w:name="__RefHeading___Toc1570_1162042918"/>
+      <w:bookmarkStart w:id="31" w:name="__RefHeading___Toc1570_4137183342"/>
       <w:bookmarkEnd w:id="31"/>
       <w:r>
         <w:rPr/>

</xml_diff>